<commit_message>
Add ensemble optimizer comparison + 2 refs (De Paris 2018, Bolstad 2009)
</commit_message>
<xml_diff>
--- a/Checkpoint_1.docx
+++ b/Checkpoint_1.docx
@@ -80,10 +80,7 @@
         <w:t>PDB Survey &amp; B-factor Extraction</w:t>
       </w:r>
       <w:r>
-        <w:t xml:space="preserve"> — </w:t>
-      </w:r>
-      <w:r>
-        <w:t>Download all holo structures of a target protein (e.g., CDK2) from the PDB; extract per-residue B-factors for binding-site residues within 5 Å of the co-crystallized ligand; compute the B-factor Index for the binding site (BFIbs) for each structure.</w:t>
+        <w:t xml:space="preserve"> — Download all holo structures of a target protein (e.g., CDK2) from the PDB; extract per-residue B-factors for binding-site residues within 5 Å of the co-crystallized ligand; compute the B-factor Index for the binding site (BFIbs) for each structure.</w:t>
       </w:r>
     </w:p>
     <w:p>
@@ -102,10 +99,7 @@
         <w:t>Cross-Docking with AutoDock Vina</w:t>
       </w:r>
       <w:r>
-        <w:t xml:space="preserve"> — </w:t>
-      </w:r>
-      <w:r>
-        <w:t>For every pair of structures (receptor A + ligand B, A ≠ B), run rigid docking; measure RMSD between the docked pose and the crystal pose; classify each pair as success (RMSD &lt; 2 Å) or failure.</w:t>
+        <w:t xml:space="preserve"> — For every pair of structures (receptor A + ligand B, A ≠ B), run rigid docking; measure RMSD between the docked pose and the crystal pose; classify each pair as success (RMSD &lt; 2 Å) or failure.</w:t>
       </w:r>
     </w:p>
     <w:p>
@@ -124,10 +118,26 @@
         <w:t>B-factor–Guided Ensemble Docking</w:t>
       </w:r>
       <w:r>
-        <w:t xml:space="preserve"> — </w:t>
-      </w:r>
-      <w:r>
-        <w:t>Select receptor ensembles using three strategies: BFIbs-guided (structures closest to BFIbs = 1), random (baseline), and lowest-B-factor (most rigid binding sites). Dock each ligand against all ensemble members, taking the best pose. Compare success rates to test whether B-factors improve ensemble selection over random.</w:t>
+        <w:t xml:space="preserve"> — Select receptor ensembles using three strategies: BFIbs-guided (structures closest to BFIbs = 1), random (baseline), and lowest-B-factor (most rigid binding sites). Dock each ligand against all ensemble members, taking the best pose. Compare success rates to test whether B-factors improve ensemble selection over random.</w:t>
+      </w:r>
+    </w:p>
+    <w:p>
+      <w:pPr>
+        <w:pStyle w:val="ListParagraph"/>
+        <w:numPr>
+          <w:ilvl w:val="0"/>
+          <w:numId w:val="1"/>
+        </w:numPr>
+        <w:spacing w:after="60"/>
+      </w:pPr>
+      <w:r>
+        <w:rPr>
+          <w:b/>
+        </w:rPr>
+        <w:t>Ensemble Optimizer Comparison</w:t>
+      </w:r>
+      <w:r>
+        <w:t xml:space="preserve"> — Implement an iterative ensemble optimizer (De Paris et al., 2018; Bolstad &amp; Anderson, 2009) as a literature-based upper bound: cluster receptor conformations by docking-score feedback, then compare its success rate against B-factor-guided and random selection to benchmark our method.</w:t>
       </w:r>
     </w:p>
     <w:p>
@@ -389,6 +399,78 @@
       </w:pPr>
       <w:r>
         <w:t>Found that backbone motions and side-chain rotations are decoupled—a fundamental limitation for using B-factors (which primarily reflect backbone motion) to predict side-chain flexibility. This is the most important counter-argument to our hypothesis.</w:t>
+      </w:r>
+    </w:p>
+    <w:p>
+      <w:pPr>
+        <w:pStyle w:val="ListParagraph"/>
+        <w:numPr>
+          <w:ilvl w:val="0"/>
+          <w:numId w:val="2"/>
+        </w:numPr>
+        <w:spacing w:after="60"/>
+      </w:pPr>
+      <w:r>
+        <w:rPr>
+          <w:b/>
+          <w:bCs/>
+        </w:rPr>
+        <w:t xml:space="preserve">De Paris, R., Vahl Quevedo, C., Ruiz, D. D., Gargano, F., &amp; de Souza, O. N. (2018). A selective method for optimizing ensemble docking-based experiments on an InhA fully-flexible receptor model. </w:t>
+      </w:r>
+      <w:r>
+        <w:rPr>
+          <w:i/>
+          <w:iCs/>
+        </w:rPr>
+        <w:t>BMC Bioinformatics, 19</w:t>
+      </w:r>
+      <w:r>
+        <w:t>, 235. https://doi.org/10.1186/s12859-018-2228-9</w:t>
+      </w:r>
+    </w:p>
+    <w:p>
+      <w:pPr>
+        <w:spacing w:after="160"/>
+        <w:ind w:left="720"/>
+      </w:pPr>
+      <w:r>
+        <w:t>Proposes a hierarchical clustering strategy for ensemble selection using docking-score feedback—an iterative optimizer that picks conformations based on how well they dock, rather than structural similarity alone. Serves as the literature benchmark for ensemble optimization.</w:t>
+      </w:r>
+    </w:p>
+    <w:p>
+      <w:pPr>
+        <w:pStyle w:val="ListParagraph"/>
+        <w:numPr>
+          <w:ilvl w:val="0"/>
+          <w:numId w:val="2"/>
+        </w:numPr>
+        <w:spacing w:after="60"/>
+      </w:pPr>
+      <w:r>
+        <w:rPr>
+          <w:b/>
+          <w:bCs/>
+        </w:rPr>
+        <w:t xml:space="preserve">Bolstad, A. C., &amp; Anderson, A. C. (2009). In pursuit of virtual lead optimization: Pruning ensembles of receptor structures for increased efficiency and accuracy during docking. </w:t>
+      </w:r>
+      <w:r>
+        <w:rPr>
+          <w:i/>
+          <w:iCs/>
+        </w:rPr>
+        <w:t>Journal of Computer-Aided Molecular Design, 23</w:t>
+      </w:r>
+      <w:r>
+        <w:t>(11), 755–763. https://doi.org/10.1007/s10822-009-9220-9</w:t>
+      </w:r>
+    </w:p>
+    <w:p>
+      <w:pPr>
+        <w:spacing w:after="300"/>
+        <w:ind w:left="720"/>
+      </w:pPr>
+      <w:r>
+        <w:t>Introduces a relative-distance-based pruning method that retains ensemble members whose active-site core geometry best preserves the conserved ligand-binding pharmacophore. Demonstrates that geometric pruning can match the accuracy of full ensembles at a fraction of the computational cost.</w:t>
       </w:r>
     </w:p>
     <w:p>

</xml_diff>

<commit_message>
Shorten challenges section (5 items condensed ~50%)
</commit_message>
<xml_diff>
--- a/Checkpoint_1.docx
+++ b/Checkpoint_1.docx
@@ -502,7 +502,7 @@
         <w:spacing w:after="120"/>
       </w:pPr>
       <w:r>
-        <w:t>Najmanovich et al. (2000) demonstrated that backbone motion (what B-factors primarily measure) and side-chain rotation (what actually gatekeeps ligand access) are statistically unrelated. A residue could have a low backbone B-factor but a rotatable side-chain that blocks the pocket, or vice versa. This means B-factors may have fundamentally limited predictive power for docking accuracy. The ensemble approach partially mitigates this by sampling multiple backbone conformations, but does not eliminate it. Our analysis should separately examine residues where side-chain flexibility is known to matter (e.g., gatekeeper residues in kinases) vs. backbone-only motion.</w:t>
+        <w:t>Backbone B-factors do not directly report on side-chain rotations (Najmanovich et al., 2000)—a residue with low backbone B-factor may still have a flexible side-chain that blocks the pocket. We will separately analyze residues where side-chain flexibility matters (e.g., gatekeeper residues in kinases) vs. backbone-only motion.</w:t>
       </w:r>
     </w:p>
     <w:p>
@@ -518,9 +518,7 @@
         <w:spacing w:after="120"/>
       </w:pPr>
       <w:r>
-        <w:t xml:space="preserve">The entire experiment depends on selecting a protein with enough structural diversity in the PDB. CDK2 (our default candidate) has ~50 holo structures, but the conformational range might be narrow if most structures were solved with similar inhibitors. A target with too little flexibility </w:t>
-        <w:lastRenderedPageBreak/>
-        <w:t>produces a ceiling effect (all docking succeeds, no signal). A target with too much flexibility (e.g., HIV protease) may produce a floor effect (all docking fails). We must run the PDB survey, compute pairwise RMSD between structures, and validate that conformational diversity exists before committing to a target.</w:t>
+        <w:t xml:space="preserve">Too little conformational diversity produces a ceiling effect (all docking succeeds); too much produces a floor effect (all docking fails). CDK2 structures solved with similar inhibitors may lack meaningful variation. We will compute pairwise RMSD across structures to validate diversity before committing to a target.</w:t>
       </w:r>
     </w:p>
     <w:p>
@@ -536,7 +534,7 @@
         <w:spacing w:after="120"/>
       </w:pPr>
       <w:r>
-        <w:t>With ~10–20 structures, the number of cross-docking pairs grows combinatorially, but the effective sample size is limited by structural diversity. If only 5 structures are truly conformationally distinct, BFIbs-based selection is choosing from at most 5 meaningfully different options—making it difficult to achieve statistical significance over random selection. We will report effect sizes and confidence intervals alongside p-values, and emphasize qualitative trends and consistency across ensemble sizes rather than relying solely on statistical significance.</w:t>
+        <w:t>With limited structurally distinct conformations, BFIbs selection operates on few meaningful options—reducing statistical power. We will report effect sizes and confidence intervals alongside p-values, emphasizing qualitative trends over significance alone.</w:t>
       </w:r>
     </w:p>
     <w:p>
@@ -552,7 +550,7 @@
         <w:spacing w:after="120"/>
       </w:pPr>
       <w:r>
-        <w:t>AutoDock Vina is faster but systematically less accurate than gold-standard docking engines (Glide, GOLD, ICM). Its scoring function may not be sensitive enough to detect the subtle conformational effects we study, potentially washing out real B-factor–RMSD correlations. Korb et al. (2012) showed that scoring function quality is a dominant factor in ensemble docking performance. We will cross-validate with a second scoring function if time permits, and acknowledge this as a limitation. Using Vina also means we cannot claim our conclusions generalize to all docking engines.</w:t>
+        <w:t>Vina is faster but less accurate than Glide, GOLD, or ICM (Korb et al., 2012); its scoring function may wash out subtle conformational effects. Cross-validation with a second scoring function is planned if time permits, and we acknowledge that conclusions may not generalize to all docking engines.</w:t>
       </w:r>
     </w:p>
     <w:p>
@@ -568,7 +566,7 @@
         <w:spacing w:after="120"/>
       </w:pPr>
       <w:r>
-        <w:t>The strongest claim we can make is correlational—“B-factors correlate with docking accuracy.” The causal claim (“B-factors predict docking accuracy because they measure flexibility”) requires ruling out confounding variables: resolution bias (B-factors are resolution-dependent), crystal packing artifacts (B-factors reflect crystal contacts, not solution behavior), and ligand effects (co-crystallized ligands themselves affect local B-factors). We mitigate this by normalizing B-factors relative to protein-wide averages (which BFIbs already does), checking whether BFIbs correlates with resolution in our dataset, and explicitly distinguishing correlation from causation throughout the paper.</w:t>
+        <w:t>We can only claim correlation, not causation. Confounds include resolution bias, crystal packing artifacts, and ligand-induced B-factor changes. We normalize B-factors via BFIbs, check for resolution dependence, and explicitly distinguish correlation from causation throughout.</w:t>
       </w:r>
     </w:p>
     <w:p>

</xml_diff>